<commit_message>
Remove virtual environment from tracking
</commit_message>
<xml_diff>
--- a/report/Report.docx
+++ b/report/Report.docx
@@ -83,47 +83,7 @@
           <w:lang w:eastAsia="en-GB"/>
           <w14:ligatures w14:val="none"/>
         </w:rPr>
-        <w:t xml:space="preserve">This project demonstrates a complete end-to-end data science workflow using both a publicly available Human Activity Recognition (HAR) dataset and self-collected sensor data from an MPU6050 accelerometer and gyroscope connected to a Raspberry Pi 4. The study showcases the ability to handle real-world sensor data, including preprocessing, feature extraction, exploratory data analysis (EDA), and machine learning model development. The HAR dataset provides clean, pre-processed feature vectors derived from time- and frequency-domain transformations, allowing the focus to be on model selection and evaluation. In parallel, real-world sensor data were collected for six activities—walking, running, sitting, standing, climbing stairs, and descending stairs—to demonstrate practical challenges such as noise, variability, and data </w:t>
-      </w:r>
-      <w:proofErr w:type="spellStart"/>
-      <w:r>
-        <w:rPr>
-          <w:rFonts w:ascii="Times New Roman" w:eastAsia="Times New Roman" w:hAnsi="Times New Roman" w:cs="Times New Roman"/>
-          <w:kern w:val="0"/>
-          <w:lang w:eastAsia="en-GB"/>
-          <w14:ligatures w14:val="none"/>
-        </w:rPr>
-        <w:t>labeling</w:t>
-      </w:r>
-      <w:proofErr w:type="spellEnd"/>
-      <w:r>
-        <w:rPr>
-          <w:rFonts w:ascii="Times New Roman" w:eastAsia="Times New Roman" w:hAnsi="Times New Roman" w:cs="Times New Roman"/>
-          <w:kern w:val="0"/>
-          <w:lang w:eastAsia="en-GB"/>
-          <w14:ligatures w14:val="none"/>
-        </w:rPr>
-        <w:t xml:space="preserve">. Features were extracted from time-series windows to enable classification. Machine learning models, including Random Forest and </w:t>
-      </w:r>
-      <w:proofErr w:type="spellStart"/>
-      <w:r>
-        <w:rPr>
-          <w:rFonts w:ascii="Times New Roman" w:eastAsia="Times New Roman" w:hAnsi="Times New Roman" w:cs="Times New Roman"/>
-          <w:kern w:val="0"/>
-          <w:lang w:eastAsia="en-GB"/>
-          <w14:ligatures w14:val="none"/>
-        </w:rPr>
-        <w:t>XGBoost</w:t>
-      </w:r>
-      <w:proofErr w:type="spellEnd"/>
-      <w:r>
-        <w:rPr>
-          <w:rFonts w:ascii="Times New Roman" w:eastAsia="Times New Roman" w:hAnsi="Times New Roman" w:cs="Times New Roman"/>
-          <w:kern w:val="0"/>
-          <w:lang w:eastAsia="en-GB"/>
-          <w14:ligatures w14:val="none"/>
-        </w:rPr>
-        <w:t>, were trained and evaluated using metrics such as accuracy, precision, recall, and confusion matrices. The results illustrate differences in model performance between benchmark and real-world data, highlighting the importance of preprocessing and feature engineering in achieving robust predictions. This study emphasizes the integration of theoretical concepts and practical implementation, demonstrating proficiency in data pipeline management, AI/ML model development, and professional reporting of results in line with data science best practices.</w:t>
+        <w:t>This project demonstrates a complete end-to-end data science workflow using both a publicly available Human Activity Recognition (HAR) dataset and self-collected sensor data from an MPU6050 accelerometer and gyroscope connected to a Raspberry Pi 4. The study showcases the ability to handle real-world sensor data, including preprocessing, feature extraction, exploratory data analysis (EDA), and machine learning model development. The HAR dataset provides clean, pre-processed feature vectors derived from time- and frequency-domain transformations, allowing the focus to be on model selection and evaluation. In parallel, real-world sensor data were collected for six activities—walking, running, sitting, standing, climbing stairs, and descending stairs—to demonstrate practical challenges such as noise, variability, and data labeling. Features were extracted from time-series windows to enable classification. Machine learning models, including Random Forest and XGBoost, were trained and evaluated using metrics such as accuracy, precision, recall, and confusion matrices. The results illustrate differences in model performance between benchmark and real-world data, highlighting the importance of preprocessing and feature engineering in achieving robust predictions. This study emphasizes the integration of theoretical concepts and practical implementation, demonstrating proficiency in data pipeline management, AI/ML model development, and professional reporting of results in line with data science best practices.</w:t>
       </w:r>
     </w:p>
     <w:p>
@@ -172,47 +132,7 @@
           <w:lang w:eastAsia="en-GB"/>
           <w14:ligatures w14:val="none"/>
         </w:rPr>
-        <w:t xml:space="preserve">Human Activity Recognition (HAR) has emerged as a critical research area in data science with applications in health monitoring, fitness tracking, assisted living, and smart environments. Wearable and embedded sensors, such as accelerometers and gyroscopes, enable continuous, non-intrusive collection of motion data. This data can be </w:t>
-      </w:r>
-      <w:proofErr w:type="spellStart"/>
-      <w:r>
-        <w:rPr>
-          <w:rFonts w:ascii="Times New Roman" w:eastAsia="Times New Roman" w:hAnsi="Times New Roman" w:cs="Times New Roman"/>
-          <w:kern w:val="0"/>
-          <w:lang w:eastAsia="en-GB"/>
-          <w14:ligatures w14:val="none"/>
-        </w:rPr>
-        <w:t>analyzed</w:t>
-      </w:r>
-      <w:proofErr w:type="spellEnd"/>
-      <w:r>
-        <w:rPr>
-          <w:rFonts w:ascii="Times New Roman" w:eastAsia="Times New Roman" w:hAnsi="Times New Roman" w:cs="Times New Roman"/>
-          <w:kern w:val="0"/>
-          <w:lang w:eastAsia="en-GB"/>
-          <w14:ligatures w14:val="none"/>
-        </w:rPr>
-        <w:t xml:space="preserve"> to identify patterns associated with different activities, supporting interventions, monitoring, and personalized analytics. Public datasets like the UCI HAR dataset provide clean, structured, and academically reliable data, but they do not capture the variability, noise, or real-world irregularities encountered during practical sensor data collection. By generating additional real-world sensor data with an MPU6050 module connected to a Raspberry Pi 4, this project demonstrates the ability to preprocess, </w:t>
-      </w:r>
-      <w:proofErr w:type="spellStart"/>
-      <w:r>
-        <w:rPr>
-          <w:rFonts w:ascii="Times New Roman" w:eastAsia="Times New Roman" w:hAnsi="Times New Roman" w:cs="Times New Roman"/>
-          <w:kern w:val="0"/>
-          <w:lang w:eastAsia="en-GB"/>
-          <w14:ligatures w14:val="none"/>
-        </w:rPr>
-        <w:t>analyze</w:t>
-      </w:r>
-      <w:proofErr w:type="spellEnd"/>
-      <w:r>
-        <w:rPr>
-          <w:rFonts w:ascii="Times New Roman" w:eastAsia="Times New Roman" w:hAnsi="Times New Roman" w:cs="Times New Roman"/>
-          <w:kern w:val="0"/>
-          <w:lang w:eastAsia="en-GB"/>
-          <w14:ligatures w14:val="none"/>
-        </w:rPr>
-        <w:t>, and model noisy, real-world signals. This approach allows students to showcase practical data handling skills alongside theoretical knowledge, highlighting the importance of robust preprocessing, feature extraction, and pipeline management in real-world applications.</w:t>
+        <w:t>Human Activity Recognition (HAR) has emerged as a critical research area in data science with applications in health monitoring, fitness tracking, assisted living, and smart environments. Wearable and embedded sensors, such as accelerometers and gyroscopes, enable continuous, non-intrusive collection of motion data. This data can be analyzed to identify patterns associated with different activities, supporting interventions, monitoring, and personalized analytics. Public datasets like the UCI HAR dataset provide clean, structured, and academically reliable data, but they do not capture the variability, noise, or real-world irregularities encountered during practical sensor data collection. By generating additional real-world sensor data with an MPU6050 module connected to a Raspberry Pi 4, this project demonstrates the ability to preprocess, analyze, and model noisy, real-world signals. This approach allows students to showcase practical data handling skills alongside theoretical knowledge, highlighting the importance of robust preprocessing, feature extraction, and pipeline management in real-world applications.</w:t>
       </w:r>
     </w:p>
     <w:p>
@@ -299,25 +219,14 @@
           <w14:ligatures w14:val="none"/>
         </w:rPr>
       </w:pPr>
-      <w:proofErr w:type="spellStart"/>
-      <w:r>
-        <w:rPr>
-          <w:rFonts w:ascii="Times New Roman" w:eastAsia="Times New Roman" w:hAnsi="Times New Roman" w:cs="Times New Roman"/>
-          <w:kern w:val="0"/>
-          <w:lang w:eastAsia="en-GB"/>
-          <w14:ligatures w14:val="none"/>
-        </w:rPr>
-        <w:t>Analyze</w:t>
-      </w:r>
-      <w:proofErr w:type="spellEnd"/>
-      <w:r>
-        <w:rPr>
-          <w:rFonts w:ascii="Times New Roman" w:eastAsia="Times New Roman" w:hAnsi="Times New Roman" w:cs="Times New Roman"/>
-          <w:kern w:val="0"/>
-          <w:lang w:eastAsia="en-GB"/>
-          <w14:ligatures w14:val="none"/>
-        </w:rPr>
-        <w:t xml:space="preserve"> the publicly available HAR dataset and prepare it for machine learning. </w:t>
+      <w:r>
+        <w:rPr>
+          <w:rFonts w:ascii="Times New Roman" w:eastAsia="Times New Roman" w:hAnsi="Times New Roman" w:cs="Times New Roman"/>
+          <w:kern w:val="0"/>
+          <w:lang w:eastAsia="en-GB"/>
+          <w14:ligatures w14:val="none"/>
+        </w:rPr>
+        <w:t xml:space="preserve">Analyze the publicly available HAR dataset and prepare it for machine learning. </w:t>
       </w:r>
     </w:p>
     <w:p>
@@ -389,27 +298,7 @@
           <w:lang w:eastAsia="en-GB"/>
           <w14:ligatures w14:val="none"/>
         </w:rPr>
-        <w:t xml:space="preserve">Train and evaluate appropriate machine learning models, including Random Forest and </w:t>
-      </w:r>
-      <w:proofErr w:type="spellStart"/>
-      <w:r>
-        <w:rPr>
-          <w:rFonts w:ascii="Times New Roman" w:eastAsia="Times New Roman" w:hAnsi="Times New Roman" w:cs="Times New Roman"/>
-          <w:kern w:val="0"/>
-          <w:lang w:eastAsia="en-GB"/>
-          <w14:ligatures w14:val="none"/>
-        </w:rPr>
-        <w:t>XGBoost</w:t>
-      </w:r>
-      <w:proofErr w:type="spellEnd"/>
-      <w:r>
-        <w:rPr>
-          <w:rFonts w:ascii="Times New Roman" w:eastAsia="Times New Roman" w:hAnsi="Times New Roman" w:cs="Times New Roman"/>
-          <w:kern w:val="0"/>
-          <w:lang w:eastAsia="en-GB"/>
-          <w14:ligatures w14:val="none"/>
-        </w:rPr>
-        <w:t xml:space="preserve">. </w:t>
+        <w:t xml:space="preserve">Train and evaluate appropriate machine learning models, including Random Forest and XGBoost. </w:t>
       </w:r>
     </w:p>
     <w:p>
@@ -565,6 +454,17 @@
         </w:rPr>
         <w:t>Dataset Description:</w:t>
       </w:r>
+      <w:r>
+        <w:rPr>
+          <w:rFonts w:ascii="Times New Roman" w:eastAsia="Times New Roman" w:hAnsi="Times New Roman" w:cs="Times New Roman"/>
+          <w:b/>
+          <w:bCs/>
+          <w:kern w:val="0"/>
+          <w:lang w:eastAsia="en-GB"/>
+          <w14:ligatures w14:val="none"/>
+        </w:rPr>
+        <w:t xml:space="preserve"> (verify these results with graphs)</w:t>
+      </w:r>
     </w:p>
     <w:p>
       <w:pPr>
@@ -1135,25 +1035,14 @@
           <w14:ligatures w14:val="none"/>
         </w:rPr>
       </w:pPr>
-      <w:proofErr w:type="spellStart"/>
-      <w:r>
-        <w:rPr>
-          <w:rFonts w:ascii="Times New Roman" w:eastAsia="Times New Roman" w:hAnsi="Times New Roman" w:cs="Times New Roman"/>
-          <w:kern w:val="0"/>
-          <w:lang w:eastAsia="en-GB"/>
-          <w14:ligatures w14:val="none"/>
-        </w:rPr>
-        <w:t>XGBoost</w:t>
-      </w:r>
-      <w:proofErr w:type="spellEnd"/>
-      <w:r>
-        <w:rPr>
-          <w:rFonts w:ascii="Times New Roman" w:eastAsia="Times New Roman" w:hAnsi="Times New Roman" w:cs="Times New Roman"/>
-          <w:kern w:val="0"/>
-          <w:lang w:eastAsia="en-GB"/>
-          <w14:ligatures w14:val="none"/>
-        </w:rPr>
-        <w:t xml:space="preserve">: strong performance on tabular data, handles noise well. </w:t>
+      <w:r>
+        <w:rPr>
+          <w:rFonts w:ascii="Times New Roman" w:eastAsia="Times New Roman" w:hAnsi="Times New Roman" w:cs="Times New Roman"/>
+          <w:kern w:val="0"/>
+          <w:lang w:eastAsia="en-GB"/>
+          <w14:ligatures w14:val="none"/>
+        </w:rPr>
+        <w:t xml:space="preserve">XGBoost: strong performance on tabular data, handles noise well. </w:t>
       </w:r>
     </w:p>
     <w:p>
@@ -1269,27 +1158,7 @@
           <w:lang w:eastAsia="en-GB"/>
           <w14:ligatures w14:val="none"/>
         </w:rPr>
-        <w:t xml:space="preserve">Python, Pandas, NumPy, Matplotlib, Seaborn, Scikit-learn, </w:t>
-      </w:r>
-      <w:proofErr w:type="spellStart"/>
-      <w:r>
-        <w:rPr>
-          <w:rFonts w:ascii="Times New Roman" w:eastAsia="Times New Roman" w:hAnsi="Times New Roman" w:cs="Times New Roman"/>
-          <w:kern w:val="0"/>
-          <w:lang w:eastAsia="en-GB"/>
-          <w14:ligatures w14:val="none"/>
-        </w:rPr>
-        <w:t>XGBoost</w:t>
-      </w:r>
-      <w:proofErr w:type="spellEnd"/>
-      <w:r>
-        <w:rPr>
-          <w:rFonts w:ascii="Times New Roman" w:eastAsia="Times New Roman" w:hAnsi="Times New Roman" w:cs="Times New Roman"/>
-          <w:kern w:val="0"/>
-          <w:lang w:eastAsia="en-GB"/>
-          <w14:ligatures w14:val="none"/>
-        </w:rPr>
-        <w:t xml:space="preserve"> </w:t>
+        <w:t xml:space="preserve">Python, Pandas, NumPy, Matplotlib, Seaborn, Scikit-learn, XGBoost </w:t>
       </w:r>
     </w:p>
     <w:p>
@@ -1328,65 +1197,14 @@
           <w14:ligatures w14:val="none"/>
         </w:rPr>
       </w:pPr>
-      <w:proofErr w:type="spellStart"/>
-      <w:r>
-        <w:rPr>
-          <w:rFonts w:ascii="Times New Roman" w:eastAsia="Times New Roman" w:hAnsi="Times New Roman" w:cs="Times New Roman"/>
-          <w:kern w:val="0"/>
-          <w:lang w:eastAsia="en-GB"/>
-          <w14:ligatures w14:val="none"/>
-        </w:rPr>
-        <w:t>GridSearchCV</w:t>
-      </w:r>
-      <w:proofErr w:type="spellEnd"/>
-      <w:r>
-        <w:rPr>
-          <w:rFonts w:ascii="Times New Roman" w:eastAsia="Times New Roman" w:hAnsi="Times New Roman" w:cs="Times New Roman"/>
-          <w:kern w:val="0"/>
-          <w:lang w:eastAsia="en-GB"/>
-          <w14:ligatures w14:val="none"/>
-        </w:rPr>
-        <w:t xml:space="preserve"> for Random Forest (</w:t>
-      </w:r>
-      <w:proofErr w:type="spellStart"/>
-      <w:r>
-        <w:rPr>
-          <w:rFonts w:ascii="Times New Roman" w:eastAsia="Times New Roman" w:hAnsi="Times New Roman" w:cs="Times New Roman"/>
-          <w:kern w:val="0"/>
-          <w:lang w:eastAsia="en-GB"/>
-          <w14:ligatures w14:val="none"/>
-        </w:rPr>
-        <w:t>n_estimators</w:t>
-      </w:r>
-      <w:proofErr w:type="spellEnd"/>
-      <w:r>
-        <w:rPr>
-          <w:rFonts w:ascii="Times New Roman" w:eastAsia="Times New Roman" w:hAnsi="Times New Roman" w:cs="Times New Roman"/>
-          <w:kern w:val="0"/>
-          <w:lang w:eastAsia="en-GB"/>
-          <w14:ligatures w14:val="none"/>
-        </w:rPr>
-        <w:t xml:space="preserve">, </w:t>
-      </w:r>
-      <w:proofErr w:type="spellStart"/>
-      <w:r>
-        <w:rPr>
-          <w:rFonts w:ascii="Times New Roman" w:eastAsia="Times New Roman" w:hAnsi="Times New Roman" w:cs="Times New Roman"/>
-          <w:kern w:val="0"/>
-          <w:lang w:eastAsia="en-GB"/>
-          <w14:ligatures w14:val="none"/>
-        </w:rPr>
-        <w:t>max_depth</w:t>
-      </w:r>
-      <w:proofErr w:type="spellEnd"/>
-      <w:r>
-        <w:rPr>
-          <w:rFonts w:ascii="Times New Roman" w:eastAsia="Times New Roman" w:hAnsi="Times New Roman" w:cs="Times New Roman"/>
-          <w:kern w:val="0"/>
-          <w:lang w:eastAsia="en-GB"/>
-          <w14:ligatures w14:val="none"/>
-        </w:rPr>
-        <w:t xml:space="preserve">). </w:t>
+      <w:r>
+        <w:rPr>
+          <w:rFonts w:ascii="Times New Roman" w:eastAsia="Times New Roman" w:hAnsi="Times New Roman" w:cs="Times New Roman"/>
+          <w:kern w:val="0"/>
+          <w:lang w:eastAsia="en-GB"/>
+          <w14:ligatures w14:val="none"/>
+        </w:rPr>
+        <w:t xml:space="preserve">GridSearchCV for Random Forest (n_estimators, max_depth). </w:t>
       </w:r>
     </w:p>
     <w:p>
@@ -1410,27 +1228,7 @@
           <w:lang w:eastAsia="en-GB"/>
           <w14:ligatures w14:val="none"/>
         </w:rPr>
-        <w:t xml:space="preserve">Early stopping for </w:t>
-      </w:r>
-      <w:proofErr w:type="spellStart"/>
-      <w:r>
-        <w:rPr>
-          <w:rFonts w:ascii="Times New Roman" w:eastAsia="Times New Roman" w:hAnsi="Times New Roman" w:cs="Times New Roman"/>
-          <w:kern w:val="0"/>
-          <w:lang w:eastAsia="en-GB"/>
-          <w14:ligatures w14:val="none"/>
-        </w:rPr>
-        <w:t>XGBoost</w:t>
-      </w:r>
-      <w:proofErr w:type="spellEnd"/>
-      <w:r>
-        <w:rPr>
-          <w:rFonts w:ascii="Times New Roman" w:eastAsia="Times New Roman" w:hAnsi="Times New Roman" w:cs="Times New Roman"/>
-          <w:kern w:val="0"/>
-          <w:lang w:eastAsia="en-GB"/>
-          <w14:ligatures w14:val="none"/>
-        </w:rPr>
-        <w:t xml:space="preserve"> to prevent overfitting. </w:t>
+        <w:t xml:space="preserve">Early stopping for XGBoost to prevent overfitting. </w:t>
       </w:r>
     </w:p>
     <w:p>
@@ -1514,27 +1312,7 @@
           <w:lang w:eastAsia="en-GB"/>
           <w14:ligatures w14:val="none"/>
         </w:rPr>
-        <w:t xml:space="preserve">, </w:t>
-      </w:r>
-      <w:proofErr w:type="spellStart"/>
-      <w:r>
-        <w:rPr>
-          <w:rFonts w:ascii="Times New Roman" w:eastAsia="Times New Roman" w:hAnsi="Times New Roman" w:cs="Times New Roman"/>
-          <w:kern w:val="0"/>
-          <w:lang w:eastAsia="en-GB"/>
-          <w14:ligatures w14:val="none"/>
-        </w:rPr>
-        <w:t>XGBoost</w:t>
-      </w:r>
-      <w:proofErr w:type="spellEnd"/>
-      <w:r>
-        <w:rPr>
-          <w:rFonts w:ascii="Times New Roman" w:eastAsia="Times New Roman" w:hAnsi="Times New Roman" w:cs="Times New Roman"/>
-          <w:kern w:val="0"/>
-          <w:lang w:eastAsia="en-GB"/>
-          <w14:ligatures w14:val="none"/>
-        </w:rPr>
-        <w:t xml:space="preserve"> slightly higher. </w:t>
+        <w:t xml:space="preserve">, XGBoost slightly higher. </w:t>
       </w:r>
     </w:p>
     <w:p>
@@ -5249,6 +5027,7 @@
   <w:style w:type="character" w:default="1" w:styleId="DefaultParagraphFont">
     <w:name w:val="Default Paragraph Font"/>
     <w:uiPriority w:val="1"/>
+    <w:semiHidden/>
     <w:unhideWhenUsed/>
   </w:style>
   <w:style w:type="table" w:default="1" w:styleId="TableNormal">

</xml_diff>